<commit_message>
Update Project Documentation and add Architecture Diagram
</commit_message>
<xml_diff>
--- a/Project_Documentation.docx
+++ b/Project_Documentation.docx
@@ -61,16 +61,7 @@
           <w:sz w:val="24"/>
           <w:shd w:fill="auto" w:val="clear"/>
         </w:rPr>
-        <w:t xml:space="preserve">Author: </w:t>
-      </w:r>
-      <w:r>
-        <w:rPr>
-          <w:b/>
-          <w:color w:val="333333"/>
-          <w:sz w:val="24"/>
-          <w:shd w:fill="auto" w:val="clear"/>
-        </w:rPr>
-        <w:t>R Shruti Rao</w:t>
+        <w:t>Author: R Shruti Rao</w:t>
       </w:r>
     </w:p>
     <w:p>
@@ -116,8 +107,8 @@
         </w:tblCellMar>
       </w:tblPr>
       <w:tblGrid>
-        <w:gridCol w:w="2700"/>
-        <w:gridCol w:w="8597"/>
+        <w:gridCol w:w="2699"/>
+        <w:gridCol w:w="8598"/>
       </w:tblGrid>
       <w:tr>
         <w:trPr>
@@ -125,7 +116,7 @@
         </w:trPr>
         <w:tc>
           <w:tcPr>
-            <w:tcW w:w="2700" w:type="dxa"/>
+            <w:tcW w:w="2699" w:type="dxa"/>
             <w:tcBorders/>
             <w:vAlign w:val="center"/>
           </w:tcPr>
@@ -147,7 +138,7 @@
         </w:tc>
         <w:tc>
           <w:tcPr>
-            <w:tcW w:w="8597" w:type="dxa"/>
+            <w:tcW w:w="8598" w:type="dxa"/>
             <w:tcBorders/>
             <w:vAlign w:val="center"/>
           </w:tcPr>
@@ -172,7 +163,7 @@
         <w:trPr/>
         <w:tc>
           <w:tcPr>
-            <w:tcW w:w="2700" w:type="dxa"/>
+            <w:tcW w:w="2699" w:type="dxa"/>
             <w:tcBorders/>
             <w:vAlign w:val="center"/>
           </w:tcPr>
@@ -192,7 +183,7 @@
         </w:tc>
         <w:tc>
           <w:tcPr>
-            <w:tcW w:w="8597" w:type="dxa"/>
+            <w:tcW w:w="8598" w:type="dxa"/>
             <w:tcBorders/>
             <w:vAlign w:val="center"/>
           </w:tcPr>
@@ -215,7 +206,7 @@
         <w:trPr/>
         <w:tc>
           <w:tcPr>
-            <w:tcW w:w="2700" w:type="dxa"/>
+            <w:tcW w:w="2699" w:type="dxa"/>
             <w:tcBorders/>
             <w:vAlign w:val="center"/>
           </w:tcPr>
@@ -235,7 +226,7 @@
         </w:tc>
         <w:tc>
           <w:tcPr>
-            <w:tcW w:w="8597" w:type="dxa"/>
+            <w:tcW w:w="8598" w:type="dxa"/>
             <w:tcBorders/>
             <w:vAlign w:val="center"/>
           </w:tcPr>
@@ -258,7 +249,7 @@
         <w:trPr/>
         <w:tc>
           <w:tcPr>
-            <w:tcW w:w="2700" w:type="dxa"/>
+            <w:tcW w:w="2699" w:type="dxa"/>
             <w:tcBorders/>
             <w:vAlign w:val="center"/>
           </w:tcPr>
@@ -278,7 +269,7 @@
         </w:tc>
         <w:tc>
           <w:tcPr>
-            <w:tcW w:w="8597" w:type="dxa"/>
+            <w:tcW w:w="8598" w:type="dxa"/>
             <w:tcBorders/>
             <w:vAlign w:val="center"/>
           </w:tcPr>
@@ -301,7 +292,7 @@
         <w:trPr/>
         <w:tc>
           <w:tcPr>
-            <w:tcW w:w="2700" w:type="dxa"/>
+            <w:tcW w:w="2699" w:type="dxa"/>
             <w:tcBorders/>
             <w:vAlign w:val="center"/>
           </w:tcPr>
@@ -321,7 +312,7 @@
         </w:tc>
         <w:tc>
           <w:tcPr>
-            <w:tcW w:w="8597" w:type="dxa"/>
+            <w:tcW w:w="8598" w:type="dxa"/>
             <w:tcBorders/>
             <w:vAlign w:val="center"/>
           </w:tcPr>
@@ -367,210 +358,70 @@
     </w:p>
     <w:p>
       <w:pPr>
-        <w:pStyle w:val="PreformattedText"/>
-        <w:bidi w:val="0"/>
-        <w:jc w:val="left"/>
-        <w:rPr/>
-      </w:pPr>
-      <w:r>
-        <w:rPr/>
-        <w:t>Employee caller</w:t>
-      </w:r>
-    </w:p>
-    <w:p>
-      <w:pPr>
-        <w:pStyle w:val="PreformattedText"/>
-        <w:bidi w:val="0"/>
-        <w:jc w:val="left"/>
-        <w:rPr/>
-      </w:pPr>
-      <w:r>
-        <w:rPr/>
-        <w:t xml:space="preserve">      </w:t>
-      </w:r>
-      <w:r>
-        <w:rPr/>
-        <w:t>|</w:t>
-      </w:r>
-    </w:p>
-    <w:p>
-      <w:pPr>
-        <w:pStyle w:val="PreformattedText"/>
-        <w:bidi w:val="0"/>
-        <w:jc w:val="left"/>
-        <w:rPr/>
-      </w:pPr>
-      <w:r>
-        <w:rPr/>
-        <w:t xml:space="preserve">      </w:t>
-      </w:r>
-      <w:r>
-        <w:rPr/>
-        <w:t>v</w:t>
-      </w:r>
-    </w:p>
-    <w:p>
-      <w:pPr>
-        <w:pStyle w:val="PreformattedText"/>
-        <w:bidi w:val="0"/>
-        <w:jc w:val="left"/>
-        <w:rPr/>
-      </w:pPr>
-      <w:r>
-        <w:rPr/>
-        <w:t>ElevenLabs Intake Orchestrator</w:t>
-      </w:r>
-    </w:p>
-    <w:p>
-      <w:pPr>
-        <w:pStyle w:val="PreformattedText"/>
-        <w:bidi w:val="0"/>
-        <w:jc w:val="left"/>
-        <w:rPr/>
-      </w:pPr>
-      <w:r>
-        <w:rPr/>
-        <w:t xml:space="preserve">      </w:t>
-      </w:r>
-      <w:r>
-        <w:rPr/>
-        <w:t>|</w:t>
-      </w:r>
-    </w:p>
-    <w:p>
-      <w:pPr>
-        <w:pStyle w:val="PreformattedText"/>
-        <w:bidi w:val="0"/>
-        <w:jc w:val="left"/>
-        <w:rPr/>
-      </w:pPr>
-      <w:r>
-        <w:rPr/>
-        <w:t xml:space="preserve">      </w:t>
-      </w:r>
-      <w:r>
-        <w:rPr/>
-        <w:t>+--&gt; Employee Verification  ---&gt; /employees/verify</w:t>
-      </w:r>
-    </w:p>
-    <w:p>
-      <w:pPr>
-        <w:pStyle w:val="PreformattedText"/>
-        <w:bidi w:val="0"/>
-        <w:jc w:val="left"/>
-        <w:rPr/>
-      </w:pPr>
-      <w:r>
-        <w:rPr/>
-        <w:t xml:space="preserve">      </w:t>
-      </w:r>
-      <w:r>
-        <w:rPr/>
-        <w:t>+--&gt; IT Resolution Specialist -&gt; /incidents/{category} + runbooks</w:t>
-      </w:r>
-    </w:p>
-    <w:p>
-      <w:pPr>
-        <w:pStyle w:val="PreformattedText"/>
-        <w:bidi w:val="0"/>
-        <w:jc w:val="left"/>
-        <w:rPr/>
-      </w:pPr>
-      <w:r>
-        <w:rPr/>
-        <w:t xml:space="preserve">      </w:t>
-      </w:r>
-      <w:r>
-        <w:rPr/>
-        <w:t>+--&gt; IT Escalation Coordinator -&gt; /tickets</w:t>
-      </w:r>
-    </w:p>
-    <w:p>
-      <w:pPr>
-        <w:pStyle w:val="PreformattedText"/>
-        <w:bidi w:val="0"/>
-        <w:jc w:val="left"/>
-        <w:rPr/>
-      </w:pPr>
-      <w:r>
-        <w:rPr/>
-        <w:t xml:space="preserve">      </w:t>
-      </w:r>
-      <w:r>
-        <w:rPr/>
-        <w:t>|</w:t>
-      </w:r>
-    </w:p>
-    <w:p>
-      <w:pPr>
-        <w:pStyle w:val="PreformattedText"/>
-        <w:bidi w:val="0"/>
-        <w:jc w:val="left"/>
-        <w:rPr/>
-      </w:pPr>
-      <w:r>
-        <w:rPr/>
-        <w:t xml:space="preserve">      </w:t>
-      </w:r>
-      <w:r>
-        <w:rPr/>
-        <w:t>v</w:t>
-      </w:r>
-    </w:p>
-    <w:p>
-      <w:pPr>
-        <w:pStyle w:val="PreformattedText"/>
-        <w:bidi w:val="0"/>
-        <w:jc w:val="left"/>
-        <w:rPr/>
-      </w:pPr>
-      <w:r>
-        <w:rPr/>
-        <w:t>Post-call review webhook -&gt; /webhooks/elevenlabs/post-call</w:t>
-      </w:r>
-    </w:p>
-    <w:p>
-      <w:pPr>
-        <w:pStyle w:val="PreformattedText"/>
-        <w:bidi w:val="0"/>
-        <w:jc w:val="left"/>
-        <w:rPr/>
-      </w:pPr>
-      <w:r>
-        <w:rPr/>
-        <w:t xml:space="preserve">      </w:t>
-      </w:r>
-      <w:r>
-        <w:rPr/>
-        <w:t>|</w:t>
-      </w:r>
-    </w:p>
-    <w:p>
-      <w:pPr>
-        <w:pStyle w:val="PreformattedText"/>
-        <w:bidi w:val="0"/>
-        <w:jc w:val="left"/>
-        <w:rPr/>
-      </w:pPr>
-      <w:r>
-        <w:rPr/>
-        <w:t xml:space="preserve">      </w:t>
-      </w:r>
-      <w:r>
-        <w:rPr/>
-        <w:t>v</w:t>
-      </w:r>
-    </w:p>
-    <w:p>
-      <w:pPr>
-        <w:pStyle w:val="PreformattedText"/>
-        <w:bidi w:val="0"/>
-        <w:jc w:val="left"/>
-        <w:rPr/>
-      </w:pPr>
-      <w:r>
-        <w:rPr/>
-        <w:t>Streamlit demo dashboard</w:t>
+        <w:pStyle w:val="BodyText"/>
+        <w:bidi w:val="0"/>
+        <w:jc w:val="left"/>
+        <w:rPr/>
+      </w:pPr>
+      <w:r>
+        <w:rPr/>
+      </w:r>
+    </w:p>
+    <w:p>
+      <w:pPr>
+        <w:pStyle w:val="BodyText"/>
+        <w:bidi w:val="0"/>
+        <w:jc w:val="left"/>
+        <w:rPr/>
+      </w:pPr>
+      <w:r>
+        <w:rPr/>
+        <w:drawing>
+          <wp:anchor distT="0" distB="0" distL="0" distR="0" simplePos="0" relativeHeight="5" behindDoc="0" locked="0" layoutInCell="0" allowOverlap="1">
+            <wp:simplePos x="0" y="0"/>
+            <wp:positionH relativeFrom="column">
+              <wp:align>center</wp:align>
+            </wp:positionH>
+            <wp:positionV relativeFrom="paragraph">
+              <wp:posOffset>635</wp:posOffset>
+            </wp:positionV>
+            <wp:extent cx="5565775" cy="3710305"/>
+            <wp:effectExtent l="0" t="0" r="0" b="0"/>
+            <wp:wrapSquare wrapText="largest"/>
+            <wp:docPr id="1" name="Image4"/>
+            <wp:cNvGraphicFramePr>
+              <a:graphicFrameLocks xmlns:a="http://schemas.openxmlformats.org/drawingml/2006/main" noChangeAspect="1"/>
+            </wp:cNvGraphicFramePr>
+            <a:graphic xmlns:a="http://schemas.openxmlformats.org/drawingml/2006/main">
+              <a:graphicData uri="http://schemas.openxmlformats.org/drawingml/2006/picture">
+                <pic:pic xmlns:pic="http://schemas.openxmlformats.org/drawingml/2006/picture">
+                  <pic:nvPicPr>
+                    <pic:cNvPr id="1" name="Image4"/>
+                    <pic:cNvPicPr>
+                      <a:picLocks noChangeAspect="1" noChangeArrowheads="1"/>
+                    </pic:cNvPicPr>
+                  </pic:nvPicPr>
+                  <pic:blipFill>
+                    <a:blip r:embed="rId2"/>
+                    <a:stretch>
+                      <a:fillRect/>
+                    </a:stretch>
+                  </pic:blipFill>
+                  <pic:spPr bwMode="auto">
+                    <a:xfrm>
+                      <a:off x="0" y="0"/>
+                      <a:ext cx="5565775" cy="3710305"/>
+                    </a:xfrm>
+                    <a:prstGeom prst="rect">
+                      <a:avLst/>
+                    </a:prstGeom>
+                    <a:noFill/>
+                  </pic:spPr>
+                </pic:pic>
+              </a:graphicData>
+            </a:graphic>
+          </wp:anchor>
+        </w:drawing>
       </w:r>
     </w:p>
     <w:p>
@@ -600,8 +451,8 @@
       </w:tblPr>
       <w:tblGrid>
         <w:gridCol w:w="2711"/>
-        <w:gridCol w:w="4881"/>
-        <w:gridCol w:w="3747"/>
+        <w:gridCol w:w="4880"/>
+        <w:gridCol w:w="3748"/>
       </w:tblGrid>
       <w:tr>
         <w:trPr>
@@ -631,7 +482,7 @@
         </w:tc>
         <w:tc>
           <w:tcPr>
-            <w:tcW w:w="4881" w:type="dxa"/>
+            <w:tcW w:w="4880" w:type="dxa"/>
             <w:tcBorders/>
             <w:vAlign w:val="center"/>
           </w:tcPr>
@@ -653,7 +504,7 @@
         </w:tc>
         <w:tc>
           <w:tcPr>
-            <w:tcW w:w="3747" w:type="dxa"/>
+            <w:tcW w:w="3748" w:type="dxa"/>
             <w:tcBorders/>
             <w:vAlign w:val="center"/>
           </w:tcPr>
@@ -698,7 +549,7 @@
         </w:tc>
         <w:tc>
           <w:tcPr>
-            <w:tcW w:w="4881" w:type="dxa"/>
+            <w:tcW w:w="4880" w:type="dxa"/>
             <w:tcBorders/>
             <w:vAlign w:val="center"/>
           </w:tcPr>
@@ -718,7 +569,7 @@
         </w:tc>
         <w:tc>
           <w:tcPr>
-            <w:tcW w:w="3747" w:type="dxa"/>
+            <w:tcW w:w="3748" w:type="dxa"/>
             <w:tcBorders/>
             <w:vAlign w:val="center"/>
           </w:tcPr>
@@ -761,7 +612,7 @@
         </w:tc>
         <w:tc>
           <w:tcPr>
-            <w:tcW w:w="4881" w:type="dxa"/>
+            <w:tcW w:w="4880" w:type="dxa"/>
             <w:tcBorders/>
             <w:vAlign w:val="center"/>
           </w:tcPr>
@@ -781,7 +632,7 @@
         </w:tc>
         <w:tc>
           <w:tcPr>
-            <w:tcW w:w="3747" w:type="dxa"/>
+            <w:tcW w:w="3748" w:type="dxa"/>
             <w:tcBorders/>
             <w:vAlign w:val="center"/>
           </w:tcPr>
@@ -824,7 +675,7 @@
         </w:tc>
         <w:tc>
           <w:tcPr>
-            <w:tcW w:w="4881" w:type="dxa"/>
+            <w:tcW w:w="4880" w:type="dxa"/>
             <w:tcBorders/>
             <w:vAlign w:val="center"/>
           </w:tcPr>
@@ -844,7 +695,7 @@
         </w:tc>
         <w:tc>
           <w:tcPr>
-            <w:tcW w:w="3747" w:type="dxa"/>
+            <w:tcW w:w="3748" w:type="dxa"/>
             <w:tcBorders/>
             <w:vAlign w:val="center"/>
           </w:tcPr>
@@ -887,7 +738,7 @@
         </w:tc>
         <w:tc>
           <w:tcPr>
-            <w:tcW w:w="4881" w:type="dxa"/>
+            <w:tcW w:w="4880" w:type="dxa"/>
             <w:tcBorders/>
             <w:vAlign w:val="center"/>
           </w:tcPr>
@@ -907,7 +758,7 @@
         </w:tc>
         <w:tc>
           <w:tcPr>
-            <w:tcW w:w="3747" w:type="dxa"/>
+            <w:tcW w:w="3748" w:type="dxa"/>
             <w:tcBorders/>
             <w:vAlign w:val="center"/>
           </w:tcPr>
@@ -950,7 +801,7 @@
         </w:tc>
         <w:tc>
           <w:tcPr>
-            <w:tcW w:w="4881" w:type="dxa"/>
+            <w:tcW w:w="4880" w:type="dxa"/>
             <w:tcBorders/>
             <w:vAlign w:val="center"/>
           </w:tcPr>
@@ -970,7 +821,7 @@
         </w:tc>
         <w:tc>
           <w:tcPr>
-            <w:tcW w:w="3747" w:type="dxa"/>
+            <w:tcW w:w="3748" w:type="dxa"/>
             <w:tcBorders/>
             <w:vAlign w:val="center"/>
           </w:tcPr>
@@ -1013,7 +864,7 @@
         </w:tc>
         <w:tc>
           <w:tcPr>
-            <w:tcW w:w="4881" w:type="dxa"/>
+            <w:tcW w:w="4880" w:type="dxa"/>
             <w:tcBorders/>
             <w:vAlign w:val="center"/>
           </w:tcPr>
@@ -1033,7 +884,7 @@
         </w:tc>
         <w:tc>
           <w:tcPr>
-            <w:tcW w:w="3747" w:type="dxa"/>
+            <w:tcW w:w="3748" w:type="dxa"/>
             <w:tcBorders/>
             <w:vAlign w:val="center"/>
           </w:tcPr>
@@ -1081,8 +932,8 @@
       <w:tblGrid>
         <w:gridCol w:w="2265"/>
         <w:gridCol w:w="3023"/>
-        <w:gridCol w:w="2983"/>
-        <w:gridCol w:w="3068"/>
+        <w:gridCol w:w="2982"/>
+        <w:gridCol w:w="3069"/>
       </w:tblGrid>
       <w:tr>
         <w:trPr>
@@ -1134,7 +985,7 @@
         </w:tc>
         <w:tc>
           <w:tcPr>
-            <w:tcW w:w="2983" w:type="dxa"/>
+            <w:tcW w:w="2982" w:type="dxa"/>
             <w:tcBorders/>
             <w:vAlign w:val="center"/>
           </w:tcPr>
@@ -1156,7 +1007,7 @@
         </w:tc>
         <w:tc>
           <w:tcPr>
-            <w:tcW w:w="3068" w:type="dxa"/>
+            <w:tcW w:w="3069" w:type="dxa"/>
             <w:tcBorders/>
             <w:vAlign w:val="center"/>
           </w:tcPr>
@@ -1221,7 +1072,7 @@
         </w:tc>
         <w:tc>
           <w:tcPr>
-            <w:tcW w:w="2983" w:type="dxa"/>
+            <w:tcW w:w="2982" w:type="dxa"/>
             <w:tcBorders/>
             <w:vAlign w:val="center"/>
           </w:tcPr>
@@ -1241,7 +1092,7 @@
         </w:tc>
         <w:tc>
           <w:tcPr>
-            <w:tcW w:w="3068" w:type="dxa"/>
+            <w:tcW w:w="3069" w:type="dxa"/>
             <w:tcBorders/>
             <w:vAlign w:val="center"/>
           </w:tcPr>
@@ -1304,7 +1155,7 @@
         </w:tc>
         <w:tc>
           <w:tcPr>
-            <w:tcW w:w="2983" w:type="dxa"/>
+            <w:tcW w:w="2982" w:type="dxa"/>
             <w:tcBorders/>
             <w:vAlign w:val="center"/>
           </w:tcPr>
@@ -1324,7 +1175,7 @@
         </w:tc>
         <w:tc>
           <w:tcPr>
-            <w:tcW w:w="3068" w:type="dxa"/>
+            <w:tcW w:w="3069" w:type="dxa"/>
             <w:tcBorders/>
             <w:vAlign w:val="center"/>
           </w:tcPr>
@@ -1387,7 +1238,7 @@
         </w:tc>
         <w:tc>
           <w:tcPr>
-            <w:tcW w:w="2983" w:type="dxa"/>
+            <w:tcW w:w="2982" w:type="dxa"/>
             <w:tcBorders/>
             <w:vAlign w:val="center"/>
           </w:tcPr>
@@ -1407,7 +1258,7 @@
         </w:tc>
         <w:tc>
           <w:tcPr>
-            <w:tcW w:w="3068" w:type="dxa"/>
+            <w:tcW w:w="3069" w:type="dxa"/>
             <w:tcBorders/>
             <w:vAlign w:val="center"/>
           </w:tcPr>
@@ -1470,7 +1321,7 @@
         </w:tc>
         <w:tc>
           <w:tcPr>
-            <w:tcW w:w="2983" w:type="dxa"/>
+            <w:tcW w:w="2982" w:type="dxa"/>
             <w:tcBorders/>
             <w:vAlign w:val="center"/>
           </w:tcPr>
@@ -1490,7 +1341,7 @@
         </w:tc>
         <w:tc>
           <w:tcPr>
-            <w:tcW w:w="3068" w:type="dxa"/>
+            <w:tcW w:w="3069" w:type="dxa"/>
             <w:tcBorders/>
             <w:vAlign w:val="center"/>
           </w:tcPr>
@@ -1553,7 +1404,7 @@
         </w:tc>
         <w:tc>
           <w:tcPr>
-            <w:tcW w:w="2983" w:type="dxa"/>
+            <w:tcW w:w="2982" w:type="dxa"/>
             <w:tcBorders/>
             <w:vAlign w:val="center"/>
           </w:tcPr>
@@ -1573,7 +1424,7 @@
         </w:tc>
         <w:tc>
           <w:tcPr>
-            <w:tcW w:w="3068" w:type="dxa"/>
+            <w:tcW w:w="3069" w:type="dxa"/>
             <w:tcBorders/>
             <w:vAlign w:val="center"/>
           </w:tcPr>
@@ -2929,7 +2780,7 @@
             <wp:extent cx="5565775" cy="3339465"/>
             <wp:effectExtent l="0" t="0" r="0" b="0"/>
             <wp:wrapSquare wrapText="largest"/>
-            <wp:docPr id="1" name="Image2"/>
+            <wp:docPr id="2" name="Image2"/>
             <wp:cNvGraphicFramePr>
               <a:graphicFrameLocks xmlns:a="http://schemas.openxmlformats.org/drawingml/2006/main" noChangeAspect="1"/>
             </wp:cNvGraphicFramePr>
@@ -2937,13 +2788,13 @@
               <a:graphicData uri="http://schemas.openxmlformats.org/drawingml/2006/picture">
                 <pic:pic xmlns:pic="http://schemas.openxmlformats.org/drawingml/2006/picture">
                   <pic:nvPicPr>
-                    <pic:cNvPr id="1" name="Image2"/>
+                    <pic:cNvPr id="2" name="Image2"/>
                     <pic:cNvPicPr>
                       <a:picLocks noChangeAspect="1" noChangeArrowheads="1"/>
                     </pic:cNvPicPr>
                   </pic:nvPicPr>
                   <pic:blipFill>
-                    <a:blip r:embed="rId2"/>
+                    <a:blip r:embed="rId3"/>
                     <a:stretch>
                       <a:fillRect/>
                     </a:stretch>
@@ -2986,7 +2837,7 @@
             <wp:extent cx="5565775" cy="3244850"/>
             <wp:effectExtent l="0" t="0" r="0" b="0"/>
             <wp:wrapSquare wrapText="largest"/>
-            <wp:docPr id="2" name="Image3"/>
+            <wp:docPr id="3" name="Image3"/>
             <wp:cNvGraphicFramePr>
               <a:graphicFrameLocks xmlns:a="http://schemas.openxmlformats.org/drawingml/2006/main" noChangeAspect="1"/>
             </wp:cNvGraphicFramePr>
@@ -2994,13 +2845,13 @@
               <a:graphicData uri="http://schemas.openxmlformats.org/drawingml/2006/picture">
                 <pic:pic xmlns:pic="http://schemas.openxmlformats.org/drawingml/2006/picture">
                   <pic:nvPicPr>
-                    <pic:cNvPr id="2" name="Image3"/>
+                    <pic:cNvPr id="3" name="Image3"/>
                     <pic:cNvPicPr>
                       <a:picLocks noChangeAspect="1" noChangeArrowheads="1"/>
                     </pic:cNvPicPr>
                   </pic:nvPicPr>
                   <pic:blipFill>
-                    <a:blip r:embed="rId3"/>
+                    <a:blip r:embed="rId4"/>
                     <a:stretch>
                       <a:fillRect/>
                     </a:stretch>
@@ -3037,7 +2888,12 @@
         </w:rPr>
       </w:pPr>
       <w:r>
-        <w:rPr/>
+        <w:rPr>
+          <w:b/>
+          <w:color w:val="1F4D78"/>
+          <w:bdr w:val="dashed" w:sz="2" w:space="18" w:color="B6C2D0"/>
+          <w:shd w:fill="F4F6F9" w:val="clear"/>
+        </w:rPr>
       </w:r>
     </w:p>
     <w:p>
@@ -3047,6 +2903,10 @@
         <w:jc w:val="left"/>
         <w:rPr/>
       </w:pPr>
+      <w:r>
+        <w:rPr/>
+        <w:t>11</w:t>
+      </w:r>
       <w:r>
         <w:rPr/>
         <w:t>ElevenLabs Workflow Snapshot</w:t>
@@ -3067,7 +2927,12 @@
         </w:rPr>
       </w:pPr>
       <w:r>
-        <w:rPr/>
+        <w:rPr>
+          <w:b/>
+          <w:color w:val="1F4D78"/>
+          <w:bdr w:val="dashed" w:sz="2" w:space="18" w:color="B6C2D0"/>
+          <w:shd w:fill="F4F6F9" w:val="clear"/>
+        </w:rPr>
         <w:drawing>
           <wp:anchor distT="0" distB="0" distL="0" distR="0" simplePos="0" relativeHeight="2" behindDoc="0" locked="0" layoutInCell="0" allowOverlap="1">
             <wp:simplePos x="0" y="0"/>
@@ -3080,7 +2945,7 @@
             <wp:extent cx="6289675" cy="5236210"/>
             <wp:effectExtent l="0" t="0" r="0" b="0"/>
             <wp:wrapSquare wrapText="largest"/>
-            <wp:docPr id="3" name="Image1"/>
+            <wp:docPr id="4" name="Image1"/>
             <wp:cNvGraphicFramePr>
               <a:graphicFrameLocks xmlns:a="http://schemas.openxmlformats.org/drawingml/2006/main" noChangeAspect="1"/>
             </wp:cNvGraphicFramePr>
@@ -3088,13 +2953,13 @@
               <a:graphicData uri="http://schemas.openxmlformats.org/drawingml/2006/picture">
                 <pic:pic xmlns:pic="http://schemas.openxmlformats.org/drawingml/2006/picture">
                   <pic:nvPicPr>
-                    <pic:cNvPr id="3" name="Image1"/>
+                    <pic:cNvPr id="4" name="Image1"/>
                     <pic:cNvPicPr>
                       <a:picLocks noChangeAspect="1" noChangeArrowheads="1"/>
                     </pic:cNvPicPr>
                   </pic:nvPicPr>
                   <pic:blipFill>
-                    <a:blip r:embed="rId4"/>
+                    <a:blip r:embed="rId5"/>
                     <a:stretch>
                       <a:fillRect/>
                     </a:stretch>
@@ -4372,12 +4237,17 @@
       <w:szCs w:val="26"/>
     </w:rPr>
   </w:style>
-  <w:style w:type="character" w:styleId="EndnoteCharacters">
-    <w:name w:val="Endnote Characters"/>
+  <w:style w:type="character" w:styleId="EndnoteCharactersuser">
+    <w:name w:val="Endnote Characters (user)"/>
     <w:qFormat/>
     <w:rPr>
       <w:vertAlign w:val="superscript"/>
     </w:rPr>
+  </w:style>
+  <w:style w:type="character" w:styleId="EndnoteCharacters">
+    <w:name w:val="Endnote Characters"/>
+    <w:qFormat/>
+    <w:rPr/>
   </w:style>
   <w:style w:type="character" w:styleId="EndnoteReference">
     <w:name w:val="endnote reference"/>
@@ -4385,28 +4255,23 @@
       <w:vertAlign w:val="superscript"/>
     </w:rPr>
   </w:style>
-  <w:style w:type="character" w:styleId="FootnoteCharacters">
-    <w:name w:val="Footnote Characters"/>
+  <w:style w:type="character" w:styleId="FootnoteCharactersuser">
+    <w:name w:val="Footnote Characters (user)"/>
     <w:qFormat/>
     <w:rPr>
       <w:vertAlign w:val="superscript"/>
     </w:rPr>
+  </w:style>
+  <w:style w:type="character" w:styleId="FootnoteCharacters">
+    <w:name w:val="Footnote Characters"/>
+    <w:qFormat/>
+    <w:rPr/>
   </w:style>
   <w:style w:type="character" w:styleId="FootnoteReference">
     <w:name w:val="footnote reference"/>
     <w:rPr>
       <w:vertAlign w:val="superscript"/>
     </w:rPr>
-  </w:style>
-  <w:style w:type="character" w:styleId="EndnoteCharactersuser">
-    <w:name w:val="Endnote Characters (user)"/>
-    <w:qFormat/>
-    <w:rPr/>
-  </w:style>
-  <w:style w:type="character" w:styleId="FootnoteCharactersuser">
-    <w:name w:val="Footnote Characters (user)"/>
-    <w:qFormat/>
-    <w:rPr/>
   </w:style>
   <w:style w:type="character" w:styleId="Hyperlink">
     <w:name w:val="Hyperlink"/>
@@ -4415,8 +4280,8 @@
       <w:u w:val="single"/>
     </w:rPr>
   </w:style>
-  <w:style w:type="character" w:styleId="Bulletsuser">
-    <w:name w:val="Bullets (user)"/>
+  <w:style w:type="character" w:styleId="Bullets">
+    <w:name w:val="Bullets"/>
     <w:qFormat/>
     <w:rPr>
       <w:rFonts w:ascii="OpenSymbol" w:hAnsi="OpenSymbol" w:eastAsia="OpenSymbol" w:cs="OpenSymbol"/>

</xml_diff>